<commit_message>
docs: correct round 3 #6 — column count, not naming
Original finding said "service boards have 5 columns; ours has 4."
Verified against the live reference: ours also has 5 (TO DO / IN
PROGRESS / BLOCKED / NEEDS REVIEW / DONE). Counts match.

Real divergence is the label on the fourth column:
- Our build (Ops + service kanban): "NEEDS REVIEW"
- Portal Ops board: "NEEDS REVIEW" (matches ours)
- Portal service kanban: "Review" (one word, differs from both)

Reframed #6 as a LOW-severity naming consistency issue. Updated the
cover subtitle to mention three HIGH bugs (the third is the Clients
filter buckets not summing to All).

Co-Authored-By: Claude Opus 4.7 <noreply@anthropic.com>
</commit_message>
<xml_diff>
--- a/docs/qa-comparison/round3-wiring-audit.docx
+++ b/docs/qa-comparison/round3-wiring-audit.docx
@@ -55,7 +55,7 @@
           <w:color w:val="5A5A5A"/>
           <w:sz w:val="24"/>
         </w:rPr>
-        <w:t>End-to-end click-through audit on the deployed portal vs. the live reference build. Found 9 wiring issues across 5 surfaces; Weekly WIP and Templates have no new wiring divergences this round (carry-overs from round 2 still apply). The two HIGH-severity bugs are a dead Delegate button on Home and a count mismatch between Portfolio Health and the Clients filter.</w:t>
+        <w:t>End-to-end click-through audit on the deployed portal vs. the live reference build. Found 9 wiring issues across 5 surfaces; Weekly WIP and Templates have no new wiring divergences this round (carry-overs from round 2 still apply). The three HIGH-severity bugs are a dead Delegate button on Home, a count mismatch between Portfolio Health and the Clients filter, and the Clients filter buckets not summing to the All total.</w:t>
       </w:r>
     </w:p>
     <w:p>
@@ -69,7 +69,7 @@
           <w:color w:val="5A5A5A"/>
           <w:sz w:val="22"/>
         </w:rPr>
-        <w:t>Findings: 3 high · 5 medium · 1 low</w:t>
+        <w:t>Findings: 3 high · 4 medium · 2 low</w:t>
       </w:r>
     </w:p>
     <w:p>
@@ -909,7 +909,7 @@
               <w:bottom w:val="nil"/>
               <w:right w:val="nil"/>
             </w:tcBorders>
-            <w:shd w:val="clear" w:color="auto" w:fill="D69D2A"/>
+            <w:shd w:val="clear" w:color="auto" w:fill="4A8F4A"/>
             <w:vAlign w:val="center"/>
           </w:tcPr>
           <w:p>
@@ -923,7 +923,7 @@
                 <w:color w:val="FFFFFF"/>
                 <w:sz w:val="16"/>
               </w:rPr>
-              <w:t>MED</w:t>
+              <w:t>LOW</w:t>
             </w:r>
           </w:p>
         </w:tc>
@@ -948,7 +948,7 @@
                 <w:color w:val="1A1A1A"/>
                 <w:sz w:val="22"/>
               </w:rPr>
-              <w:t>#6. Service boards have 5 columns; ours has 4</w:t>
+              <w:t>#6. Service kanban column named "Review" instead of "NEEDS REVIEW"</w:t>
             </w:r>
           </w:p>
         </w:tc>
@@ -972,7 +972,7 @@
           <w:color w:val="1A1A1A"/>
           <w:sz w:val="20"/>
         </w:rPr>
-        <w:t>Every service kanban renders five columns: To Do, In Progress, Blocked, Review, Done. Our build ships four (no Review column).</w:t>
+        <w:t>Service boards label the fourth column "Review." The portal's own Ops board labels the same stage "NEEDS REVIEW." Inconsistent within the portal, and inconsistent with our reference build.</w:t>
       </w:r>
     </w:p>
     <w:p>
@@ -993,7 +993,7 @@
           <w:color w:val="1A1A1A"/>
           <w:sz w:val="20"/>
         </w:rPr>
-        <w:t>Four columns. The Review state was deliberately not modeled as a column; cards that need review are flagged via severity or a label, not a separate stage. Splitting it into a column adds friction (extra drag, more places to lose track of WIP) without buying real workflow value at agency scale.</w:t>
+        <w:t>"NEEDS REVIEW" everywhere. Our build uses NEEDS REVIEW on both Ops and service kanban; the portal's Ops board already matches. Only the service kanban needs to swap the label.</w:t>
       </w:r>
     </w:p>
     <w:p>
@@ -1014,7 +1014,7 @@
           <w:color w:val="1A1A1A"/>
           <w:sz w:val="20"/>
         </w:rPr>
-        <w:t>Drop the Review column. Migrate any existing Review cards into either In Progress (still being worked on) or Done (review is the gate to closing). If the dev wants to preserve a 'needs review' signal, add a label or severity flag on the card instead of a column.</w:t>
+        <w:t>Rename the service kanban's fourth column from "Review" to "NEEDS REVIEW." If the column id is hardcoded on data records, keep the id and only change the display label so existing tasks don't lose their column assignment.</w:t>
       </w:r>
     </w:p>
     <w:p>
@@ -2219,7 +2219,7 @@
               <w:bottom w:val="nil"/>
               <w:right w:val="nil"/>
             </w:tcBorders>
-            <w:shd w:val="clear" w:color="auto" w:fill="D69D2A"/>
+            <w:shd w:val="clear" w:color="auto" w:fill="4A8F4A"/>
             <w:vAlign w:val="top"/>
           </w:tcPr>
           <w:p>
@@ -2233,7 +2233,7 @@
                 <w:color w:val="FFFFFF"/>
                 <w:sz w:val="16"/>
               </w:rPr>
-              <w:t>MED</w:t>
+              <w:t>LOW</w:t>
             </w:r>
           </w:p>
         </w:tc>
@@ -2258,7 +2258,7 @@
                 <w:color w:val="1A1A1A"/>
                 <w:sz w:val="21"/>
               </w:rPr>
-              <w:t>#6. Service boards have 5 columns; ours has 4</w:t>
+              <w:t>#6. Service kanban column named "Review" instead of "NEEDS REVIEW"</w:t>
             </w:r>
             <w:r>
               <w:br/>
@@ -2268,7 +2268,7 @@
                 <w:color w:val="1A1A1A"/>
                 <w:sz w:val="20"/>
               </w:rPr>
-              <w:t>Drop the Review column. Migrate any existing Review cards into either In Progress (still being worked on) or Done (review is the gate to closing). If the dev wants to preserve a 'needs review' signal, add a label or severity flag on the card instead of a column.</w:t>
+              <w:t>Rename the service kanban's fourth column from "Review" to "NEEDS REVIEW." If the column id is hardcoded on data records, keep the id and only change the display label so existing tasks don't lose their column assignment.</w:t>
             </w:r>
           </w:p>
         </w:tc>

</xml_diff>